<commit_message>
feat: use docling for input processor and chunker with cursor chunker, add highlight key phrase and use tag html in content variable
</commit_message>
<xml_diff>
--- a/Gemini_API/SlideGenFunctionCalling/Document/nature.docx
+++ b/Gemini_API/SlideGenFunctionCalling/Document/nature.docx
@@ -4,17 +4,32 @@
   <w:body>
     <w:p>
       <w:pPr>
-        <w:pStyle w:val="ListParagraph"/>
-        <w:numPr>
-          <w:ilvl w:val="0"/>
-          <w:numId w:val="2"/>
-        </w:numPr>
-      </w:pPr>
-      <w:r>
-        <w:t>Mở đầu</w:t>
-      </w:r>
-      <w:r>
-        <w:t>: Thiên</w:t>
+        <w:pStyle w:val="Heading1"/>
+        <w:jc w:val="center"/>
+        <w:rPr>
+          <w:lang w:val="vi-VN"/>
+        </w:rPr>
+      </w:pPr>
+      <w:r>
+        <w:rPr>
+          <w:lang w:val="vi-VN"/>
+        </w:rPr>
+        <w:t xml:space="preserve">Thiên nhiên </w:t>
+      </w:r>
+      <w:r>
+        <w:rPr>
+          <w:lang w:val="vi-VN"/>
+        </w:rPr>
+        <w:t>và những điều kì thú</w:t>
+      </w:r>
+    </w:p>
+    <w:p/>
+    <w:p>
+      <w:pPr>
+        <w:pStyle w:val="Heading2"/>
+      </w:pPr>
+      <w:r>
+        <w:t>Mở đầu: Thiên</w:t>
       </w:r>
       <w:r>
         <w:rPr>
@@ -73,11 +88,7 @@
     </w:p>
     <w:p>
       <w:pPr>
-        <w:pStyle w:val="ListParagraph"/>
-        <w:numPr>
-          <w:ilvl w:val="0"/>
-          <w:numId w:val="2"/>
-        </w:numPr>
+        <w:pStyle w:val="Heading2"/>
         <w:rPr>
           <w:lang w:val="vi-VN"/>
         </w:rPr>
@@ -160,11 +171,7 @@
     </w:p>
     <w:p>
       <w:pPr>
-        <w:pStyle w:val="ListParagraph"/>
-        <w:numPr>
-          <w:ilvl w:val="0"/>
-          <w:numId w:val="2"/>
-        </w:numPr>
+        <w:pStyle w:val="Heading2"/>
         <w:rPr>
           <w:lang w:val="vi-VN"/>
         </w:rPr>
@@ -247,11 +254,7 @@
     </w:p>
     <w:p>
       <w:pPr>
-        <w:pStyle w:val="ListParagraph"/>
-        <w:numPr>
-          <w:ilvl w:val="0"/>
-          <w:numId w:val="2"/>
-        </w:numPr>
+        <w:pStyle w:val="Heading2"/>
         <w:rPr>
           <w:lang w:val="vi-VN"/>
         </w:rPr>
@@ -337,11 +340,7 @@
     </w:p>
     <w:p>
       <w:pPr>
-        <w:pStyle w:val="ListParagraph"/>
-        <w:numPr>
-          <w:ilvl w:val="0"/>
-          <w:numId w:val="2"/>
-        </w:numPr>
+        <w:pStyle w:val="Heading2"/>
         <w:rPr>
           <w:lang w:val="vi-VN"/>
         </w:rPr>
@@ -550,7 +549,7 @@
       <w:lvlText w:val="-"/>
       <w:lvlJc w:val="left"/>
       <w:pPr>
-        <w:ind w:left="1080" w:hanging="360"/>
+        <w:ind w:left="720" w:hanging="360"/>
       </w:pPr>
       <w:rPr>
         <w:rFonts w:ascii="Calibri" w:eastAsiaTheme="minorEastAsia" w:hAnsi="Calibri" w:cs="Calibri" w:hint="default"/>
@@ -562,7 +561,7 @@
       <w:lvlText w:val="o"/>
       <w:lvlJc w:val="left"/>
       <w:pPr>
-        <w:ind w:left="1800" w:hanging="360"/>
+        <w:ind w:left="1440" w:hanging="360"/>
       </w:pPr>
       <w:rPr>
         <w:rFonts w:ascii="Courier New" w:hAnsi="Courier New" w:cs="Courier New" w:hint="default"/>
@@ -574,7 +573,7 @@
       <w:lvlText w:val=""/>
       <w:lvlJc w:val="left"/>
       <w:pPr>
-        <w:ind w:left="2520" w:hanging="360"/>
+        <w:ind w:left="2160" w:hanging="360"/>
       </w:pPr>
       <w:rPr>
         <w:rFonts w:ascii="Wingdings" w:hAnsi="Wingdings" w:hint="default"/>
@@ -586,7 +585,7 @@
       <w:lvlText w:val=""/>
       <w:lvlJc w:val="left"/>
       <w:pPr>
-        <w:ind w:left="3240" w:hanging="360"/>
+        <w:ind w:left="2880" w:hanging="360"/>
       </w:pPr>
       <w:rPr>
         <w:rFonts w:ascii="Symbol" w:hAnsi="Symbol" w:hint="default"/>
@@ -598,7 +597,7 @@
       <w:lvlText w:val="o"/>
       <w:lvlJc w:val="left"/>
       <w:pPr>
-        <w:ind w:left="3960" w:hanging="360"/>
+        <w:ind w:left="3600" w:hanging="360"/>
       </w:pPr>
       <w:rPr>
         <w:rFonts w:ascii="Courier New" w:hAnsi="Courier New" w:cs="Courier New" w:hint="default"/>
@@ -610,7 +609,7 @@
       <w:lvlText w:val=""/>
       <w:lvlJc w:val="left"/>
       <w:pPr>
-        <w:ind w:left="4680" w:hanging="360"/>
+        <w:ind w:left="4320" w:hanging="360"/>
       </w:pPr>
       <w:rPr>
         <w:rFonts w:ascii="Wingdings" w:hAnsi="Wingdings" w:hint="default"/>
@@ -622,7 +621,7 @@
       <w:lvlText w:val=""/>
       <w:lvlJc w:val="left"/>
       <w:pPr>
-        <w:ind w:left="5400" w:hanging="360"/>
+        <w:ind w:left="5040" w:hanging="360"/>
       </w:pPr>
       <w:rPr>
         <w:rFonts w:ascii="Symbol" w:hAnsi="Symbol" w:hint="default"/>
@@ -634,7 +633,7 @@
       <w:lvlText w:val="o"/>
       <w:lvlJc w:val="left"/>
       <w:pPr>
-        <w:ind w:left="6120" w:hanging="360"/>
+        <w:ind w:left="5760" w:hanging="360"/>
       </w:pPr>
       <w:rPr>
         <w:rFonts w:ascii="Courier New" w:hAnsi="Courier New" w:cs="Courier New" w:hint="default"/>
@@ -646,7 +645,7 @@
       <w:lvlText w:val=""/>
       <w:lvlJc w:val="left"/>
       <w:pPr>
-        <w:ind w:left="6840" w:hanging="360"/>
+        <w:ind w:left="6480" w:hanging="360"/>
       </w:pPr>
       <w:rPr>
         <w:rFonts w:ascii="Wingdings" w:hAnsi="Wingdings" w:hint="default"/>
@@ -968,6 +967,47 @@
       <w:lang w:val="en-US" w:eastAsia="zh-CN"/>
     </w:rPr>
   </w:style>
+  <w:style w:type="paragraph" w:styleId="Heading1">
+    <w:name w:val="heading 1"/>
+    <w:basedOn w:val="Normal"/>
+    <w:next w:val="Normal"/>
+    <w:link w:val="Heading1Char"/>
+    <w:qFormat/>
+    <w:rsid w:val="00A449BC"/>
+    <w:pPr>
+      <w:keepNext/>
+      <w:keepLines/>
+      <w:spacing w:before="240"/>
+      <w:outlineLvl w:val="0"/>
+    </w:pPr>
+    <w:rPr>
+      <w:rFonts w:asciiTheme="majorHAnsi" w:eastAsiaTheme="majorEastAsia" w:hAnsiTheme="majorHAnsi" w:cstheme="majorBidi"/>
+      <w:color w:val="2E74B5" w:themeColor="accent1" w:themeShade="BF"/>
+      <w:sz w:val="32"/>
+      <w:szCs w:val="32"/>
+    </w:rPr>
+  </w:style>
+  <w:style w:type="paragraph" w:styleId="Heading2">
+    <w:name w:val="heading 2"/>
+    <w:basedOn w:val="Normal"/>
+    <w:next w:val="Normal"/>
+    <w:link w:val="Heading2Char"/>
+    <w:unhideWhenUsed/>
+    <w:qFormat/>
+    <w:rsid w:val="003D7610"/>
+    <w:pPr>
+      <w:keepNext/>
+      <w:keepLines/>
+      <w:spacing w:before="40"/>
+      <w:outlineLvl w:val="1"/>
+    </w:pPr>
+    <w:rPr>
+      <w:rFonts w:asciiTheme="majorHAnsi" w:eastAsiaTheme="majorEastAsia" w:hAnsiTheme="majorHAnsi" w:cstheme="majorBidi"/>
+      <w:color w:val="2E74B5" w:themeColor="accent1" w:themeShade="BF"/>
+      <w:sz w:val="26"/>
+      <w:szCs w:val="26"/>
+    </w:rPr>
+  </w:style>
   <w:style w:type="character" w:default="1" w:styleId="DefaultParagraphFont">
     <w:name w:val="Default Paragraph Font"/>
     <w:uiPriority w:val="1"/>
@@ -1005,6 +1045,32 @@
       <w:ind w:left="720"/>
       <w:contextualSpacing/>
     </w:pPr>
+  </w:style>
+  <w:style w:type="character" w:customStyle="1" w:styleId="Heading2Char">
+    <w:name w:val="Heading 2 Char"/>
+    <w:basedOn w:val="DefaultParagraphFont"/>
+    <w:link w:val="Heading2"/>
+    <w:rsid w:val="003D7610"/>
+    <w:rPr>
+      <w:rFonts w:asciiTheme="majorHAnsi" w:eastAsiaTheme="majorEastAsia" w:hAnsiTheme="majorHAnsi" w:cstheme="majorBidi"/>
+      <w:color w:val="2E74B5" w:themeColor="accent1" w:themeShade="BF"/>
+      <w:sz w:val="26"/>
+      <w:szCs w:val="26"/>
+      <w:lang w:val="en-US" w:eastAsia="zh-CN"/>
+    </w:rPr>
+  </w:style>
+  <w:style w:type="character" w:customStyle="1" w:styleId="Heading1Char">
+    <w:name w:val="Heading 1 Char"/>
+    <w:basedOn w:val="DefaultParagraphFont"/>
+    <w:link w:val="Heading1"/>
+    <w:rsid w:val="00A449BC"/>
+    <w:rPr>
+      <w:rFonts w:asciiTheme="majorHAnsi" w:eastAsiaTheme="majorEastAsia" w:hAnsiTheme="majorHAnsi" w:cstheme="majorBidi"/>
+      <w:color w:val="2E74B5" w:themeColor="accent1" w:themeShade="BF"/>
+      <w:sz w:val="32"/>
+      <w:szCs w:val="32"/>
+      <w:lang w:val="en-US" w:eastAsia="zh-CN"/>
+    </w:rPr>
   </w:style>
 </w:styles>
 </file>

</xml_diff>